<commit_message>
Complete source tape documentation sweep
</commit_message>
<xml_diff>
--- a/docs/ZX-UX C48 SDK Adversarial Security Review.docx
+++ b/docs/ZX-UX C48 SDK Adversarial Security Review.docx
@@ -11913,6 +11913,44 @@
       </w:pPr>
       <w:r>
         <w:t>Document scope: portable ZX-UX C48 SDK 1.0.0. Native ZX-UX security properties remain outside this host review unless a section explicitly says otherwise.</w:t>
+      </w:r>
+    </w:p>
+    <w:p>
+      <w:r>
+        <w:br w:type="page"/>
+      </w:r>
+    </w:p>
+    <w:p>
+      <w:pPr>
+        <w:pStyle w:val="Heading1"/>
+      </w:pPr>
+      <w:r>
+        <w:t>Source-tape generation and transport controls</w:t>
+      </w:r>
+    </w:p>
+    <w:p>
+      <w:r>
+        <w:t>The source-tape feature adds 57 deterministic .src.tap artifacts and the c48srctap generator. The generator is intentionally narrow: only lowercase .c, .h, and .txt input files are accepted. Unsupported or mixed input sets fail before an output file is created.</w:t>
+      </w:r>
+    </w:p>
+    <w:p>
+      <w:r>
+        <w:t>Inputs must be ASCII text with LF line endings and no NUL bytes. Each M48O basename must satisfy the native 1-to-10-byte portable-name contract, object size is bounded by the native 32768-byte limit, duplicate tape names are rejected, and existing outputs require an explicit --force replacement request.</w:t>
+      </w:r>
+    </w:p>
+    <w:p>
+      <w:r>
+        <w:t>Every generated object is RAW, targets USERHOME, carries both M48O header and logical-payload CRC-16/CCITT-FALSE values, and is emitted in bounded 512-byte payload blocks. The generator immediately decodes the completed in-memory tape and compares object names, types, targets, and payload bytes before writing the file.</w:t>
+      </w:r>
+    </w:p>
+    <w:p>
+      <w:r>
+        <w:t>The locked release corpus is regenerated from tracked sources and compared byte-for-byte during verification. Corruption tests cover TAP checksum failure and M48O payload-CRC failure. The runner matrix exercises the implementation on Linux, Windows, macOS Arm, and macOS Intel.</w:t>
+      </w:r>
+    </w:p>
+    <w:p>
+      <w:r>
+        <w:t>These controls make the source tapes deterministic transfer artifacts rather than trusted executable inputs: compilation and linking still occur inside native ZX-UX under its normal compiler, linker, object-type, memory, and runtime checks.</w:t>
       </w:r>
     </w:p>
     <w:sectPr>

</xml_diff>

<commit_message>
Document cooperative multitask runtime
</commit_message>
<xml_diff>
--- a/docs/ZX-UX C48 SDK Adversarial Security Review.docx
+++ b/docs/ZX-UX C48 SDK Adversarial Security Review.docx
@@ -4492,6 +4492,30 @@
     </w:p>
     <w:p>
       <w:pPr>
+        <w:pStyle w:val="Heading2"/>
+      </w:pPr>
+      <w:r>
+        <w:t>9.3 Cooperative multitask starvation and session ceilings</w:t>
+      </w:r>
+    </w:p>
+    <w:p>
+      <w:pPr>
+        <w:pStyle w:val="BodyText"/>
+      </w:pPr>
+      <w:r>
+        <w:t>Multitask scheduling is deliberately cooperative rather than preemptive. A process that performs ordinary computation without reaching yield(), positive sleep(), blocking input, termination, or cancellation can starve all peers. This matches the pinned native scheduling rule, but it is still a denial-of-service shape on the host. The mitigation is explicit: --max-steps is one deterministic session-wide semantic-step ceiling and --time-quota is one session-wide wall-clock ceiling. Reaching either cancels the remaining live processes and produces a nonzero session result.</w:t>
+      </w:r>
+    </w:p>
+    <w:p>
+      <w:pPr>
+        <w:pStyle w:val="BodyText"/>
+      </w:pPr>
+      <w:r>
+        <w:t>Process isolation is stronger than device isolation. Each direct process has its own VM memory, pointer provenance, globals, locals, continuation stack, heap, argv, and status. The Spectrum screen, border, sound service, ticks, and keyboard are shared. The security boundary is therefore private process state plus intentionally shared session devices, not an invented collection of virtual Spectrums.</w:t>
+      </w:r>
+    </w:p>
+    <w:p>
+      <w:pPr>
         <w:pStyle w:val="Heading1"/>
       </w:pPr>
       <w:r>
@@ -4719,6 +4743,30 @@
     </w:p>
     <w:p>
       <w:pPr>
+        <w:pStyle w:val="Heading2"/>
+      </w:pPr>
+      <w:r>
+        <w:t>10.5 Multitask input, BREAK, and completion state</w:t>
+      </w:r>
+    </w:p>
+    <w:p>
+      <w:pPr>
+        <w:pStyle w:val="BodyText"/>
+      </w:pPr>
+      <w:r>
+        <w:t>A multitask getchar() wait is an explicit blocked-process state. GUI input is polled without blocking the scheduler, and a delivered byte wakes only the current input owner. In headless multitask mode there is no blocking stdin read; a process that requests input without an injected event source fails explicitly. This keeps one waiting program from freezing unrelated runnable programs or the host session.</w:t>
+      </w:r>
+    </w:p>
+    <w:p>
+      <w:pPr>
+        <w:pStyle w:val="BodyText"/>
+      </w:pPr>
+      <w:r>
+        <w:t>The graphical completed-program footer is session-scoped. One child exiting does not mark the GUI complete. The footer changes from BREAK guidance only after every direct process is terminal. Shift+Space before that point is a global abort request, returns status 130, and cancels live processes; after completion it is only the close acknowledgement.</w:t>
+      </w:r>
+    </w:p>
+    <w:p>
+      <w:pPr>
         <w:pStyle w:val="Heading1"/>
       </w:pPr>
       <w:r>
@@ -5940,6 +5988,30 @@
       </w:pPr>
       <w:r>
         <w:t>A recursive tree inspection of the reviewed commit found no tracked path containing "fuzz", and repository code search returned no Atheris occurrence. Atheris is a Python coverage-guided fuzzing engine. The deterministic hostile-input suite is extensive, but it is still finite. We therefore do not claim coverage-guided fuzz certification for source, C48B1, or A48M. The old review recommended layered fuzz targets; that recommendation remains useful rather than magically completed by having many unit tests.</w:t>
+      </w:r>
+    </w:p>
+    <w:p>
+      <w:pPr>
+        <w:pStyle w:val="Heading2"/>
+      </w:pPr>
+      <w:r>
+        <w:t>15.5 Cooperative multitask regression evidence</w:t>
+      </w:r>
+    </w:p>
+    <w:p>
+      <w:pPr>
+        <w:pStyle w:val="BodyText"/>
+      </w:pPr>
+      <w:r>
+        <w:t>The Phase-2 regression set covers the eight-slot capacity model, PID assignment, explicit-yield round robin, zero-duration and positive sleep behavior, recursive continuation preservation, private globals and heaps, argv isolation, non-blocking input ownership, process-local failure, global abort, starvation under a deterministic safety ceiling, and session-wide resource ceilings. The frozen Hanoi and 8-Queens binaries are run together to their verified final states on one shared screen. A separate repeated synthetic tick/input regression requires identical status, event trace, and final shared screen bytes.</w:t>
+      </w:r>
+    </w:p>
+    <w:p>
+      <w:pPr>
+        <w:pStyle w:val="BodyText"/>
+      </w:pPr>
+      <w:r>
+        <w:t>The proof is intentionally bounded. It demonstrates the host cooperative contract against the pinned native semantic reference. It does not claim that host process descriptors are native kernel structures, that host wall-clock timing is repeatable, or that deferred native spawn, wait, and kill services have been emulated.</w:t>
       </w:r>
     </w:p>
     <w:p>

</xml_diff>

<commit_message>
Document native executable tape cross-development
</commit_message>
<xml_diff>
--- a/docs/ZX-UX C48 SDK Adversarial Security Review.docx
+++ b/docs/ZX-UX C48 SDK Adversarial Security Review.docx
@@ -4516,6 +4516,30 @@
     </w:p>
     <w:p>
       <w:pPr>
+        <w:pStyle w:val="Heading2"/>
+      </w:pPr>
+      <w:r>
+        <w:t>9.4 Native lowering and link fail-closed boundary</w:t>
+      </w:r>
+    </w:p>
+    <w:p>
+      <w:pPr>
+        <w:pStyle w:val="BodyText"/>
+      </w:pPr>
+      <w:r>
+        <w:t>c48b2tap treats C48B1 as untrusted structured input even though it was normally produced by the SDK compiler. It reuses the strict schema reader, rejects malformed or oversized representations, and refuses native operations whose target behavior is not implemented. Symbol resolution is fail closed: an external name must resolve through the generated program or the deterministic pinned runtime archive before output publication.</w:t>
+      </w:r>
+    </w:p>
+    <w:p>
+      <w:pPr>
+        <w:pStyle w:val="BodyText"/>
+      </w:pPr>
+      <w:r>
+        <w:t>Float5 is not silently reinterpreted as a host four-byte float. Native lowering uses five-byte storage and the pinned floating syscall ABI, including hidden result pointers and pointer-valued float arguments. Native-size and call-frame checks reject output that would exceed the admitted target contracts.</w:t>
+      </w:r>
+    </w:p>
+    <w:p>
+      <w:pPr>
         <w:pStyle w:val="Heading1"/>
       </w:pPr>
       <w:r>
@@ -4767,6 +4791,30 @@
     </w:p>
     <w:p>
       <w:pPr>
+        <w:pStyle w:val="Heading2"/>
+      </w:pPr>
+      <w:r>
+        <w:t>10.6 Native artifact transaction and size controls</w:t>
+      </w:r>
+    </w:p>
+    <w:p>
+      <w:pPr>
+        <w:pStyle w:val="BodyText"/>
+      </w:pPr>
+      <w:r>
+        <w:t>OBJ1, MEX1, and TAP destinations are committed only after complete generation and validation through a same-directory temporary file. Input/output aliasing, symlink destinations, invalid suffixes, overwrite policy, native object-name rules, CRC failures, unresolved symbols, invalid relocations, stack-policy violations, image-plus-BSS overflow, and stored-MEX1 overflow all fail before a partial replacement can appear.</w:t>
+      </w:r>
+    </w:p>
+    <w:p>
+      <w:pPr>
+        <w:pStyle w:val="BodyText"/>
+      </w:pPr>
+      <w:r>
+        <w:t>The native executable envelope is deliberately narrow: M48O version 1, RAW codec, BIN type and BIN target, with exact logical and physical payload equal to the complete MEX1. Independent decoders verify generated structures, while the pinned native toolchain is used for interoperability and execution evidence. This avoids the circular assurance of trusting only the writer that created the bytes.</w:t>
+      </w:r>
+    </w:p>
+    <w:p>
+      <w:pPr>
         <w:pStyle w:val="Heading1"/>
       </w:pPr>
       <w:r>
@@ -6012,6 +6060,30 @@
       </w:pPr>
       <w:r>
         <w:t>The proof is intentionally bounded. It demonstrates the host cooperative contract against the pinned native semantic reference. It does not claim that host process descriptors are native kernel structures, that host wall-clock timing is repeatable, or that deferred native spawn, wait, and kill services have been emulated.</w:t>
+      </w:r>
+    </w:p>
+    <w:p>
+      <w:pPr>
+        <w:pStyle w:val="Heading2"/>
+      </w:pPr>
+      <w:r>
+        <w:t>15.6 Native cross-development release evidence</w:t>
+      </w:r>
+    </w:p>
+    <w:p>
+      <w:pPr>
+        <w:pStyle w:val="BodyText"/>
+      </w:pPr>
+      <w:r>
+        <w:t>Phase 3 release evidence pins the native ZX-UX authority commit, runtime member provenance, exported-symbol set, archive order, exact prebuilt-member digests, independent OBJ1/MEX1/TAP validation, deterministic rebuilds, and native load/relocation/execution. The proof set includes recursion, integer arithmetic, globals, strings, text/graphics runtime calls, startup/exit, relocations, and a dedicated 29-31 KiB generated source whose stored MEX1 is also in that band.</w:t>
+      </w:r>
+    </w:p>
+    <w:p>
+      <w:pPr>
+        <w:pStyle w:val="BodyText"/>
+      </w:pPr>
+      <w:r>
+        <w:t>The native repository is read-only evidence. Normal c48b2tap execution never reaches into a moving native checkout. The interoperability workflow checks out the exact pinned commit and bootstraps that commit's declared project-local runtime before running native proof. The immutable pre-existing C/H corpus under demos, examples, and apps is not changed to manufacture native evidence.</w:t>
       </w:r>
     </w:p>
     <w:p>

</xml_diff>